<commit_message>
Document project and expand career details
</commit_message>
<xml_diff>
--- a/위키드_직업탐험_검사_전체_설계서.docx
+++ b/위키드_직업탐험_검사_전체_설계서.docx
@@ -539,7 +539,6 @@
               <w:spacing w:line="240" w:lineRule="auto"/>
               <w:jc w:val="center"/>
               <w:rPr>
-                <w:rFonts w:hint="eastAsia"/>
                 <w:b/>
                 <w:sz w:val="24"/>
                 <w:szCs w:val="28"/>
@@ -616,7 +615,6 @@
             <w:pPr>
               <w:jc w:val="center"/>
               <w:rPr>
-                <w:rFonts w:hint="eastAsia"/>
                 <w:sz w:val="20"/>
                 <w:szCs w:val="24"/>
                 <w:lang w:eastAsia="ko-KR"/>
@@ -645,7 +643,6 @@
           <w:p>
             <w:pPr>
               <w:rPr>
-                <w:rFonts w:hint="eastAsia"/>
                 <w:b/>
                 <w:sz w:val="22"/>
                 <w:szCs w:val="24"/>
@@ -1820,7 +1817,22 @@
                 <w:szCs w:val="24"/>
                 <w:lang w:eastAsia="ko-KR"/>
               </w:rPr>
-              <w:t>각 직업의 interestFit과 styleFit을 기준으로 점수를 계산합니다.</w:t>
+              <w:t>각 직업</w:t>
+            </w:r>
+            <w:r>
+              <w:rPr>
+                <w:rFonts w:hint="eastAsia"/>
+                <w:szCs w:val="24"/>
+                <w:lang w:eastAsia="ko-KR"/>
+              </w:rPr>
+              <w:t>의</w:t>
+            </w:r>
+            <w:r>
+              <w:rPr>
+                <w:szCs w:val="24"/>
+                <w:lang w:eastAsia="ko-KR"/>
+              </w:rPr>
+              <w:t xml:space="preserve"> ‘흥미 적합 기준’과 ‘성향 적합 기준’을 바탕으로 추천 점수를 계산합니다.</w:t>
             </w:r>
           </w:p>
         </w:tc>
@@ -1959,7 +1971,6 @@
     <w:p>
       <w:pPr>
         <w:rPr>
-          <w:rFonts w:hint="eastAsia"/>
           <w:sz w:val="20"/>
           <w:szCs w:val="24"/>
           <w:lang w:eastAsia="ko-KR"/>
@@ -5598,15 +5609,16 @@
       </w:tblPr>
       <w:tblGrid>
         <w:gridCol w:w="280"/>
-        <w:gridCol w:w="15264"/>
+        <w:gridCol w:w="15158"/>
       </w:tblGrid>
       <w:tr>
         <w:trPr>
+          <w:trHeight w:val="2102"/>
           <w:jc w:val="center"/>
         </w:trPr>
         <w:tc>
           <w:tcPr>
-            <w:tcW w:w="259" w:type="dxa"/>
+            <w:tcW w:w="278" w:type="dxa"/>
             <w:tcBorders>
               <w:top w:val="single" w:sz="6" w:space="0" w:color="B7E7A3"/>
               <w:left w:val="single" w:sz="6" w:space="0" w:color="B7E7A3"/>
@@ -5634,7 +5646,7 @@
         </w:tc>
         <w:tc>
           <w:tcPr>
-            <w:tcW w:w="15264" w:type="dxa"/>
+            <w:tcW w:w="15158" w:type="dxa"/>
             <w:tcBorders>
               <w:top w:val="single" w:sz="6" w:space="0" w:color="B7E7A3"/>
               <w:left w:val="single" w:sz="6" w:space="0" w:color="B7E7A3"/>
@@ -5674,22 +5686,74 @@
                 <w:lang w:eastAsia="ko-KR"/>
               </w:rPr>
               <w:br/>
-              <w:t>직업 점수 = 흥미 적합도 70% + 성향 적합도 30%. 흥미 적합도는 각 직업의 interestFit 가중치와 선택 점수를 곱해 계산하고, 성향 적합도는 직업이 요구하는 4개 성향 값과 사용자의 선택 점수를 비교합니다. 최고 흥미 점수와 3위 흥미 점수의 차이가 1 이하이면 “여러 분야를 고르게 탐색하는 중”으로 해석합니다.</w:t>
+              <w:t xml:space="preserve">직업 점수 = 흥미 적합도 70% + 성향 적합도 30%. 흥미 적합도는 각 직업의 </w:t>
+            </w:r>
+            <w:r>
+              <w:rPr>
+                <w:rFonts w:hint="eastAsia"/>
+                <w:sz w:val="20"/>
+                <w:szCs w:val="24"/>
+                <w:lang w:eastAsia="ko-KR"/>
+              </w:rPr>
+              <w:t>흥미 적합 기준</w:t>
+            </w:r>
+            <w:r>
+              <w:rPr>
+                <w:sz w:val="20"/>
+                <w:szCs w:val="24"/>
+                <w:lang w:eastAsia="ko-KR"/>
+              </w:rPr>
+              <w:t xml:space="preserve"> 가중치와 선택 점수를 곱해 계산하고, </w:t>
+            </w:r>
+          </w:p>
+          <w:p>
+            <w:pPr>
+              <w:jc w:val="center"/>
+              <w:rPr>
+                <w:sz w:val="20"/>
+                <w:szCs w:val="24"/>
+                <w:lang w:eastAsia="ko-KR"/>
+              </w:rPr>
+            </w:pPr>
+            <w:r>
+              <w:rPr>
+                <w:sz w:val="20"/>
+                <w:szCs w:val="24"/>
+                <w:lang w:eastAsia="ko-KR"/>
+              </w:rPr>
+              <w:t xml:space="preserve">성향 적합도는 직업이 요구하는 4개 성향 값과 사용자의 선택 점수를 비교합니다. </w:t>
+            </w:r>
+          </w:p>
+          <w:p>
+            <w:pPr>
+              <w:jc w:val="center"/>
+              <w:rPr>
+                <w:sz w:val="20"/>
+                <w:szCs w:val="24"/>
+                <w:lang w:eastAsia="ko-KR"/>
+              </w:rPr>
+            </w:pPr>
+            <w:r>
+              <w:rPr>
+                <w:sz w:val="20"/>
+                <w:szCs w:val="24"/>
+                <w:lang w:eastAsia="ko-KR"/>
+              </w:rPr>
+              <w:t>최고 흥미 점수와 3위 흥미 점수의 차이가 1 이하이면 “여러 분야를 고르게 탐색하는 중”으로 해석합니다</w:t>
+            </w:r>
+            <w:r>
+              <w:rPr>
+                <w:rFonts w:hint="eastAsia"/>
+                <w:sz w:val="20"/>
+                <w:szCs w:val="24"/>
+                <w:lang w:eastAsia="ko-KR"/>
+              </w:rPr>
+              <w:t>.</w:t>
             </w:r>
           </w:p>
         </w:tc>
       </w:tr>
     </w:tbl>
-    <w:p>
-      <w:pPr>
-        <w:jc w:val="center"/>
-        <w:rPr>
-          <w:sz w:val="20"/>
-          <w:szCs w:val="24"/>
-          <w:lang w:eastAsia="ko-KR"/>
-        </w:rPr>
-      </w:pPr>
-    </w:p>
     <w:p>
       <w:pPr>
         <w:jc w:val="center"/>
@@ -27678,7 +27742,22 @@
                 <w:szCs w:val="24"/>
                 <w:lang w:eastAsia="ko-KR"/>
               </w:rPr>
-              <w:t>직업 데이터의 reasonTemplate을 사용해 아이가 이해할 수 있는 긍정 문장으로 보여줍니다.</w:t>
+              <w:t>직업 데이터의</w:t>
+            </w:r>
+            <w:r>
+              <w:rPr>
+                <w:rFonts w:hint="eastAsia"/>
+                <w:szCs w:val="24"/>
+                <w:lang w:eastAsia="ko-KR"/>
+              </w:rPr>
+              <w:t xml:space="preserve"> 추천 이유 문장</w:t>
+            </w:r>
+            <w:r>
+              <w:rPr>
+                <w:szCs w:val="24"/>
+                <w:lang w:eastAsia="ko-KR"/>
+              </w:rPr>
+              <w:t>을 사용해 아이가 이해할 수 있는 긍정 문장으로 보여줍니다.</w:t>
             </w:r>
           </w:p>
         </w:tc>
@@ -30505,6 +30584,7 @@
   <w:style w:type="character" w:default="1" w:styleId="a2">
     <w:name w:val="Default Paragraph Font"/>
     <w:uiPriority w:val="1"/>
+    <w:semiHidden/>
     <w:unhideWhenUsed/>
   </w:style>
   <w:style w:type="table" w:default="1" w:styleId="a3">

</xml_diff>